<commit_message>
first changes to word template
</commit_message>
<xml_diff>
--- a/templates/word-template/word-template.docx
+++ b/templates/word-template/word-template.docx
@@ -48,13 +48,31 @@
         <w:t xml:space="preserve">Name)</w:t>
       </w:r>
     </w:p>
-    <w:bookmarkStart w:id="20" w:name="test"/>
+    <w:bookmarkStart w:id="22" w:name="heading-1"/>
     <w:p>
       <w:pPr>
-        <w:pStyle w:val="berschrift1"/>
+        <w:pStyle w:val="Heading1"/>
       </w:pPr>
       <w:r>
-        <w:t xml:space="preserve">Test</w:t>
+        <w:t xml:space="preserve">Heading 1</w:t>
+      </w:r>
+    </w:p>
+    <w:bookmarkStart w:id="21" w:name="heading-1.1"/>
+    <w:p>
+      <w:pPr>
+        <w:pStyle w:val="Heading2"/>
+      </w:pPr>
+      <w:r>
+        <w:t xml:space="preserve">Heading 1.1</w:t>
+      </w:r>
+    </w:p>
+    <w:bookmarkStart w:id="20" w:name="heading-1.1.1"/>
+    <w:p>
+      <w:pPr>
+        <w:pStyle w:val="Heading3"/>
+      </w:pPr>
+      <w:r>
+        <w:t xml:space="preserve">Heading 1.1.1</w:t>
       </w:r>
     </w:p>
     <w:p>
@@ -66,10 +84,12 @@
       </w:r>
     </w:p>
     <w:bookmarkEnd w:id="20"/>
-    <w:bookmarkStart w:id="21" w:name="latex-formula"/>
+    <w:bookmarkEnd w:id="21"/>
+    <w:bookmarkEnd w:id="22"/>
+    <w:bookmarkStart w:id="23" w:name="latex-formula"/>
     <w:p>
       <w:pPr>
-        <w:pStyle w:val="berschrift1"/>
+        <w:pStyle w:val="Heading1"/>
       </w:pPr>
       <w:r>
         <w:t xml:space="preserve">LaTeX formula</w:t>
@@ -355,13 +375,16 @@
         </m:oMath>
       </m:oMathPara>
     </w:p>
-    <w:bookmarkEnd w:id="21"/>
+    <w:bookmarkEnd w:id="23"/>
     <w:sectPr>
       <w:headerReference r:id="rId9" w:type="default"/>
-      <w:footerReference r:id="rId14" w:type="default"/>
-      <w:pgSz w:h="16838" w:w="11906"/>
-      <w:pgMar w:bottom="1418" w:footer="709" w:gutter="0" w:header="709" w:left="1985" w:right="1418" w:top="3119"/>
+      <w:footerReference r:id="rId12" w:type="default"/>
+      <w:headerReference r:id="rId10" w:type="first"/>
+      <w:footerReference r:id="rId11" w:type="first"/>
+      <w:pgSz w:code="9" w:h="16838" w:w="11906"/>
+      <w:pgMar w:bottom="1418" w:footer="709" w:gutter="0" w:header="709" w:left="1985" w:right="1418" w:top="1418"/>
       <w:cols w:space="708"/>
+      <w:titlePg/>
       <w:docGrid w:linePitch="360"/>
     </w:sectPr>
   </w:body>
@@ -373,100 +396,39 @@
 </file>
 
 <file path=word/footer1.xml><?xml version="1.0" encoding="utf-8"?>
-<w:ftr xmlns:wpc="http://schemas.microsoft.com/office/word/2010/wordprocessingCanvas" xmlns:cx="http://schemas.microsoft.com/office/drawing/2014/chartex" xmlns:cx1="http://schemas.microsoft.com/office/drawing/2015/9/8/chartex" xmlns:cx2="http://schemas.microsoft.com/office/drawing/2015/10/21/chartex" xmlns:cx3="http://schemas.microsoft.com/office/drawing/2016/5/9/chartex" xmlns:cx4="http://schemas.microsoft.com/office/drawing/2016/5/10/chartex" xmlns:cx5="http://schemas.microsoft.com/office/drawing/2016/5/11/chartex" xmlns:cx6="http://schemas.microsoft.com/office/drawing/2016/5/12/chartex" xmlns:cx7="http://schemas.microsoft.com/office/drawing/2016/5/13/chartex" xmlns:cx8="http://schemas.microsoft.com/office/drawing/2016/5/14/chartex" xmlns:mc="http://schemas.openxmlformats.org/markup-compatibility/2006" xmlns:aink="http://schemas.microsoft.com/office/drawing/2016/ink" xmlns:am3d="http://schemas.microsoft.com/office/drawing/2017/model3d" xmlns:o="urn:schemas-microsoft-com:office:office" xmlns:oel="http://schemas.microsoft.com/office/2019/extlst" xmlns:r="http://schemas.openxmlformats.org/officeDocument/2006/relationships" xmlns:m="http://schemas.openxmlformats.org/officeDocument/2006/math" xmlns:v="urn:schemas-microsoft-com:vml" xmlns:wp14="http://schemas.microsoft.com/office/word/2010/wordprocessingDrawing" xmlns:wp="http://schemas.openxmlformats.org/drawingml/2006/wordprocessingDrawing" xmlns:w10="urn:schemas-microsoft-com:office:word" xmlns:w="http://schemas.openxmlformats.org/wordprocessingml/2006/main" xmlns:w14="http://schemas.microsoft.com/office/word/2010/wordml" xmlns:w15="http://schemas.microsoft.com/office/word/2012/wordml" xmlns:w16cex="http://schemas.microsoft.com/office/word/2018/wordml/cex" xmlns:w16cid="http://schemas.microsoft.com/office/word/2016/wordml/cid" xmlns:w16="http://schemas.microsoft.com/office/word/2018/wordml" xmlns:w16sdtdh="http://schemas.microsoft.com/office/word/2020/wordml/sdtdatahash" xmlns:w16se="http://schemas.microsoft.com/office/word/2015/wordml/symex" xmlns:wpg="http://schemas.microsoft.com/office/word/2010/wordprocessingGroup" xmlns:wpi="http://schemas.microsoft.com/office/word/2010/wordprocessingInk" xmlns:wne="http://schemas.microsoft.com/office/word/2006/wordml" xmlns:wps="http://schemas.microsoft.com/office/word/2010/wordprocessingShape" mc:Ignorable="w14 w15 w16se w16cid w16 w16cex w16sdtdh wp14">
-  <w:tbl>
-    <w:tblPr>
-      <w:tblW w:w="0" w:type="auto"/>
-      <w:tblLayout w:type="fixed"/>
-      <w:tblLook w:val="06A0" w:firstRow="1" w:lastRow="0" w:firstColumn="1" w:lastColumn="0" w:noHBand="1" w:noVBand="1"/>
-    </w:tblPr>
-    <w:tblGrid>
-      <w:gridCol w:w="2830"/>
-      <w:gridCol w:w="2830"/>
-      <w:gridCol w:w="2830"/>
-    </w:tblGrid>
-    <w:tr>
-      <w:trPr>
-        <w:trHeight w:val="300"/>
-      </w:trPr>
-      <w:tc>
-        <w:tcPr>
-          <w:tcW w:w="2830" w:type="dxa"/>
-        </w:tcPr>
-        <w:p>
-          <w:pPr>
-            <w:pStyle w:val="Kopfzeile"/>
-            <w:ind w:left="-115"/>
-            <w:jc w:val="left"/>
-          </w:pPr>
-        </w:p>
-      </w:tc>
-      <w:tc>
-        <w:tcPr>
-          <w:tcW w:w="2830" w:type="dxa"/>
-        </w:tcPr>
-        <w:p>
-          <w:pPr>
-            <w:pStyle w:val="Kopfzeile"/>
-            <w:jc w:val="center"/>
-          </w:pPr>
-        </w:p>
-      </w:tc>
-      <w:tc>
-        <w:tcPr>
-          <w:tcW w:w="2830" w:type="dxa"/>
-        </w:tcPr>
-        <w:p>
-          <w:pPr>
-            <w:pStyle w:val="Kopfzeile"/>
-            <w:ind w:right="-115"/>
-          </w:pPr>
-        </w:p>
-      </w:tc>
-    </w:tr>
-  </w:tbl>
+<w:ftr xmlns:wpc="http://schemas.microsoft.com/office/word/2010/wordprocessingCanvas" xmlns:cx="http://schemas.microsoft.com/office/drawing/2014/chartex" xmlns:cx1="http://schemas.microsoft.com/office/drawing/2015/9/8/chartex" xmlns:cx2="http://schemas.microsoft.com/office/drawing/2015/10/21/chartex" xmlns:cx3="http://schemas.microsoft.com/office/drawing/2016/5/9/chartex" xmlns:cx4="http://schemas.microsoft.com/office/drawing/2016/5/10/chartex" xmlns:cx5="http://schemas.microsoft.com/office/drawing/2016/5/11/chartex" xmlns:cx6="http://schemas.microsoft.com/office/drawing/2016/5/12/chartex" xmlns:cx7="http://schemas.microsoft.com/office/drawing/2016/5/13/chartex" xmlns:cx8="http://schemas.microsoft.com/office/drawing/2016/5/14/chartex" xmlns:mc="http://schemas.openxmlformats.org/markup-compatibility/2006" xmlns:aink="http://schemas.microsoft.com/office/drawing/2016/ink" xmlns:am3d="http://schemas.microsoft.com/office/drawing/2017/model3d" xmlns:o="urn:schemas-microsoft-com:office:office" xmlns:oel="http://schemas.microsoft.com/office/2019/extlst" xmlns:r="http://schemas.openxmlformats.org/officeDocument/2006/relationships" xmlns:m="http://schemas.openxmlformats.org/officeDocument/2006/math" xmlns:v="urn:schemas-microsoft-com:vml" xmlns:wp14="http://schemas.microsoft.com/office/word/2010/wordprocessingDrawing" xmlns:wp="http://schemas.openxmlformats.org/drawingml/2006/wordprocessingDrawing" xmlns:w10="urn:schemas-microsoft-com:office:word" xmlns:w="http://schemas.openxmlformats.org/wordprocessingml/2006/main" xmlns:w14="http://schemas.microsoft.com/office/word/2010/wordml" xmlns:w15="http://schemas.microsoft.com/office/word/2012/wordml" xmlns:w16cex="http://schemas.microsoft.com/office/word/2018/wordml/cex" xmlns:w16cid="http://schemas.microsoft.com/office/word/2016/wordml/cid" xmlns:w16="http://schemas.microsoft.com/office/word/2018/wordml" xmlns:w16du="http://schemas.microsoft.com/office/word/2023/wordml/word16du" xmlns:w16sdtdh="http://schemas.microsoft.com/office/word/2020/wordml/sdtdatahash" xmlns:w16sdtfl="http://schemas.microsoft.com/office/word/2024/wordml/sdtformatlock" xmlns:w16se="http://schemas.microsoft.com/office/word/2015/wordml/symex" xmlns:wpg="http://schemas.microsoft.com/office/word/2010/wordprocessingGroup" xmlns:wpi="http://schemas.microsoft.com/office/word/2010/wordprocessingInk" xmlns:wne="http://schemas.microsoft.com/office/word/2006/wordml" xmlns:wps="http://schemas.microsoft.com/office/word/2010/wordprocessingShape" mc:Ignorable="w14 w15 w16se w16cid w16 w16cex w16sdtdh w16sdtfl w16du wp14">
   <w:p>
     <w:pPr>
-      <w:pStyle w:val="Fuzeile"/>
-    </w:pPr>
-  </w:p>
-</w:ftr>
-</file>
-
-<file path=word/footer2.xml><?xml version="1.0" encoding="utf-8"?>
-<w:ftr xmlns:wpc="http://schemas.microsoft.com/office/word/2010/wordprocessingCanvas" xmlns:cx="http://schemas.microsoft.com/office/drawing/2014/chartex" xmlns:cx1="http://schemas.microsoft.com/office/drawing/2015/9/8/chartex" xmlns:cx2="http://schemas.microsoft.com/office/drawing/2015/10/21/chartex" xmlns:cx3="http://schemas.microsoft.com/office/drawing/2016/5/9/chartex" xmlns:cx4="http://schemas.microsoft.com/office/drawing/2016/5/10/chartex" xmlns:cx5="http://schemas.microsoft.com/office/drawing/2016/5/11/chartex" xmlns:cx6="http://schemas.microsoft.com/office/drawing/2016/5/12/chartex" xmlns:cx7="http://schemas.microsoft.com/office/drawing/2016/5/13/chartex" xmlns:cx8="http://schemas.microsoft.com/office/drawing/2016/5/14/chartex" xmlns:mc="http://schemas.openxmlformats.org/markup-compatibility/2006" xmlns:aink="http://schemas.microsoft.com/office/drawing/2016/ink" xmlns:am3d="http://schemas.microsoft.com/office/drawing/2017/model3d" xmlns:o="urn:schemas-microsoft-com:office:office" xmlns:oel="http://schemas.microsoft.com/office/2019/extlst" xmlns:r="http://schemas.openxmlformats.org/officeDocument/2006/relationships" xmlns:m="http://schemas.openxmlformats.org/officeDocument/2006/math" xmlns:v="urn:schemas-microsoft-com:vml" xmlns:wp14="http://schemas.microsoft.com/office/word/2010/wordprocessingDrawing" xmlns:wp="http://schemas.openxmlformats.org/drawingml/2006/wordprocessingDrawing" xmlns:w10="urn:schemas-microsoft-com:office:word" xmlns:w="http://schemas.openxmlformats.org/wordprocessingml/2006/main" xmlns:w14="http://schemas.microsoft.com/office/word/2010/wordml" xmlns:w15="http://schemas.microsoft.com/office/word/2012/wordml" xmlns:w16cex="http://schemas.microsoft.com/office/word/2018/wordml/cex" xmlns:w16cid="http://schemas.microsoft.com/office/word/2016/wordml/cid" xmlns:w16="http://schemas.microsoft.com/office/word/2018/wordml" xmlns:w16sdtdh="http://schemas.microsoft.com/office/word/2020/wordml/sdtdatahash" xmlns:w16se="http://schemas.microsoft.com/office/word/2015/wordml/symex" xmlns:wpg="http://schemas.microsoft.com/office/word/2010/wordprocessingGroup" xmlns:wpi="http://schemas.microsoft.com/office/word/2010/wordprocessingInk" xmlns:wne="http://schemas.microsoft.com/office/word/2006/wordml" xmlns:wps="http://schemas.microsoft.com/office/word/2010/wordprocessingShape" mc:Ignorable="w14 w15 w16se w16cid w16 w16cex w16sdtdh wp14">
-  <w:p>
-    <w:pPr>
-      <w:pStyle w:val="Fuzeile"/>
+      <w:pStyle w:val="Footer"/>
     </w:pPr>
     <w:r>
       <w:rPr>
-        <w:rStyle w:val="Seitenzahl"/>
+        <w:rStyle w:val="PageNumber"/>
       </w:rPr>
       <w:fldChar w:fldCharType="begin"/>
     </w:r>
     <w:r>
       <w:rPr>
-        <w:rStyle w:val="Seitenzahl"/>
+        <w:rStyle w:val="PageNumber"/>
       </w:rPr>
       <w:instrText xml:space="preserve"> PAGE </w:instrText>
     </w:r>
     <w:r>
       <w:rPr>
-        <w:rStyle w:val="Seitenzahl"/>
+        <w:rStyle w:val="PageNumber"/>
       </w:rPr>
       <w:fldChar w:fldCharType="separate"/>
     </w:r>
     <w:r>
       <w:rPr>
-        <w:rStyle w:val="Seitenzahl"/>
+        <w:rStyle w:val="PageNumber"/>
         <w:noProof/>
       </w:rPr>
       <w:t>10</w:t>
     </w:r>
     <w:r>
       <w:rPr>
-        <w:rStyle w:val="Seitenzahl"/>
+        <w:rStyle w:val="PageNumber"/>
       </w:rPr>
       <w:fldChar w:fldCharType="end"/>
     </w:r>
@@ -474,40 +436,40 @@
 </w:ftr>
 </file>
 
-<file path=word/footer3.xml><?xml version="1.0" encoding="utf-8"?>
-<w:ftr xmlns:wpc="http://schemas.microsoft.com/office/word/2010/wordprocessingCanvas" xmlns:cx="http://schemas.microsoft.com/office/drawing/2014/chartex" xmlns:cx1="http://schemas.microsoft.com/office/drawing/2015/9/8/chartex" xmlns:cx2="http://schemas.microsoft.com/office/drawing/2015/10/21/chartex" xmlns:cx3="http://schemas.microsoft.com/office/drawing/2016/5/9/chartex" xmlns:cx4="http://schemas.microsoft.com/office/drawing/2016/5/10/chartex" xmlns:cx5="http://schemas.microsoft.com/office/drawing/2016/5/11/chartex" xmlns:cx6="http://schemas.microsoft.com/office/drawing/2016/5/12/chartex" xmlns:cx7="http://schemas.microsoft.com/office/drawing/2016/5/13/chartex" xmlns:cx8="http://schemas.microsoft.com/office/drawing/2016/5/14/chartex" xmlns:mc="http://schemas.openxmlformats.org/markup-compatibility/2006" xmlns:aink="http://schemas.microsoft.com/office/drawing/2016/ink" xmlns:am3d="http://schemas.microsoft.com/office/drawing/2017/model3d" xmlns:o="urn:schemas-microsoft-com:office:office" xmlns:oel="http://schemas.microsoft.com/office/2019/extlst" xmlns:r="http://schemas.openxmlformats.org/officeDocument/2006/relationships" xmlns:m="http://schemas.openxmlformats.org/officeDocument/2006/math" xmlns:v="urn:schemas-microsoft-com:vml" xmlns:wp14="http://schemas.microsoft.com/office/word/2010/wordprocessingDrawing" xmlns:wp="http://schemas.openxmlformats.org/drawingml/2006/wordprocessingDrawing" xmlns:w10="urn:schemas-microsoft-com:office:word" xmlns:w="http://schemas.openxmlformats.org/wordprocessingml/2006/main" xmlns:w14="http://schemas.microsoft.com/office/word/2010/wordml" xmlns:w15="http://schemas.microsoft.com/office/word/2012/wordml" xmlns:w16cex="http://schemas.microsoft.com/office/word/2018/wordml/cex" xmlns:w16cid="http://schemas.microsoft.com/office/word/2016/wordml/cid" xmlns:w16="http://schemas.microsoft.com/office/word/2018/wordml" xmlns:w16sdtdh="http://schemas.microsoft.com/office/word/2020/wordml/sdtdatahash" xmlns:w16se="http://schemas.microsoft.com/office/word/2015/wordml/symex" xmlns:wpg="http://schemas.microsoft.com/office/word/2010/wordprocessingGroup" xmlns:wpi="http://schemas.microsoft.com/office/word/2010/wordprocessingInk" xmlns:wne="http://schemas.microsoft.com/office/word/2006/wordml" xmlns:wps="http://schemas.microsoft.com/office/word/2010/wordprocessingShape" mc:Ignorable="w14 w15 w16se w16cid w16 w16cex w16sdtdh wp14">
+<file path=word/footer2.xml><?xml version="1.0" encoding="utf-8"?>
+<w:ftr xmlns:wpc="http://schemas.microsoft.com/office/word/2010/wordprocessingCanvas" xmlns:cx="http://schemas.microsoft.com/office/drawing/2014/chartex" xmlns:cx1="http://schemas.microsoft.com/office/drawing/2015/9/8/chartex" xmlns:cx2="http://schemas.microsoft.com/office/drawing/2015/10/21/chartex" xmlns:cx3="http://schemas.microsoft.com/office/drawing/2016/5/9/chartex" xmlns:cx4="http://schemas.microsoft.com/office/drawing/2016/5/10/chartex" xmlns:cx5="http://schemas.microsoft.com/office/drawing/2016/5/11/chartex" xmlns:cx6="http://schemas.microsoft.com/office/drawing/2016/5/12/chartex" xmlns:cx7="http://schemas.microsoft.com/office/drawing/2016/5/13/chartex" xmlns:cx8="http://schemas.microsoft.com/office/drawing/2016/5/14/chartex" xmlns:mc="http://schemas.openxmlformats.org/markup-compatibility/2006" xmlns:aink="http://schemas.microsoft.com/office/drawing/2016/ink" xmlns:am3d="http://schemas.microsoft.com/office/drawing/2017/model3d" xmlns:o="urn:schemas-microsoft-com:office:office" xmlns:oel="http://schemas.microsoft.com/office/2019/extlst" xmlns:r="http://schemas.openxmlformats.org/officeDocument/2006/relationships" xmlns:m="http://schemas.openxmlformats.org/officeDocument/2006/math" xmlns:v="urn:schemas-microsoft-com:vml" xmlns:wp14="http://schemas.microsoft.com/office/word/2010/wordprocessingDrawing" xmlns:wp="http://schemas.openxmlformats.org/drawingml/2006/wordprocessingDrawing" xmlns:w10="urn:schemas-microsoft-com:office:word" xmlns:w="http://schemas.openxmlformats.org/wordprocessingml/2006/main" xmlns:w14="http://schemas.microsoft.com/office/word/2010/wordml" xmlns:w15="http://schemas.microsoft.com/office/word/2012/wordml" xmlns:w16cex="http://schemas.microsoft.com/office/word/2018/wordml/cex" xmlns:w16cid="http://schemas.microsoft.com/office/word/2016/wordml/cid" xmlns:w16="http://schemas.microsoft.com/office/word/2018/wordml" xmlns:w16du="http://schemas.microsoft.com/office/word/2023/wordml/word16du" xmlns:w16sdtdh="http://schemas.microsoft.com/office/word/2020/wordml/sdtdatahash" xmlns:w16sdtfl="http://schemas.microsoft.com/office/word/2024/wordml/sdtformatlock" xmlns:w16se="http://schemas.microsoft.com/office/word/2015/wordml/symex" xmlns:wpg="http://schemas.microsoft.com/office/word/2010/wordprocessingGroup" xmlns:wpi="http://schemas.microsoft.com/office/word/2010/wordprocessingInk" xmlns:wne="http://schemas.microsoft.com/office/word/2006/wordml" xmlns:wps="http://schemas.microsoft.com/office/word/2010/wordprocessingShape" mc:Ignorable="w14 w15 w16se w16cid w16 w16cex w16sdtdh w16sdtfl w16du wp14">
   <w:p>
     <w:pPr>
-      <w:pStyle w:val="Fuzeile"/>
+      <w:pStyle w:val="Footer"/>
     </w:pPr>
     <w:r>
       <w:rPr>
-        <w:rStyle w:val="Seitenzahl"/>
+        <w:rStyle w:val="PageNumber"/>
       </w:rPr>
       <w:fldChar w:fldCharType="begin"/>
     </w:r>
     <w:r>
       <w:rPr>
-        <w:rStyle w:val="Seitenzahl"/>
+        <w:rStyle w:val="PageNumber"/>
       </w:rPr>
       <w:instrText xml:space="preserve"> PAGE </w:instrText>
     </w:r>
     <w:r>
       <w:rPr>
-        <w:rStyle w:val="Seitenzahl"/>
+        <w:rStyle w:val="PageNumber"/>
       </w:rPr>
       <w:fldChar w:fldCharType="separate"/>
     </w:r>
     <w:r>
       <w:rPr>
-        <w:rStyle w:val="Seitenzahl"/>
+        <w:rStyle w:val="PageNumber"/>
         <w:noProof/>
       </w:rPr>
       <w:t>2</w:t>
     </w:r>
     <w:r>
       <w:rPr>
-        <w:rStyle w:val="Seitenzahl"/>
+        <w:rStyle w:val="PageNumber"/>
       </w:rPr>
       <w:fldChar w:fldCharType="end"/>
     </w:r>
@@ -535,71 +497,10 @@
 </file>
 
 <file path=word/header1.xml><?xml version="1.0" encoding="utf-8"?>
-<w:hdr xmlns:wpc="http://schemas.microsoft.com/office/word/2010/wordprocessingCanvas" xmlns:cx="http://schemas.microsoft.com/office/drawing/2014/chartex" xmlns:cx1="http://schemas.microsoft.com/office/drawing/2015/9/8/chartex" xmlns:cx2="http://schemas.microsoft.com/office/drawing/2015/10/21/chartex" xmlns:cx3="http://schemas.microsoft.com/office/drawing/2016/5/9/chartex" xmlns:cx4="http://schemas.microsoft.com/office/drawing/2016/5/10/chartex" xmlns:cx5="http://schemas.microsoft.com/office/drawing/2016/5/11/chartex" xmlns:cx6="http://schemas.microsoft.com/office/drawing/2016/5/12/chartex" xmlns:cx7="http://schemas.microsoft.com/office/drawing/2016/5/13/chartex" xmlns:cx8="http://schemas.microsoft.com/office/drawing/2016/5/14/chartex" xmlns:mc="http://schemas.openxmlformats.org/markup-compatibility/2006" xmlns:aink="http://schemas.microsoft.com/office/drawing/2016/ink" xmlns:am3d="http://schemas.microsoft.com/office/drawing/2017/model3d" xmlns:o="urn:schemas-microsoft-com:office:office" xmlns:oel="http://schemas.microsoft.com/office/2019/extlst" xmlns:r="http://schemas.openxmlformats.org/officeDocument/2006/relationships" xmlns:m="http://schemas.openxmlformats.org/officeDocument/2006/math" xmlns:v="urn:schemas-microsoft-com:vml" xmlns:wp14="http://schemas.microsoft.com/office/word/2010/wordprocessingDrawing" xmlns:wp="http://schemas.openxmlformats.org/drawingml/2006/wordprocessingDrawing" xmlns:w10="urn:schemas-microsoft-com:office:word" xmlns:w="http://schemas.openxmlformats.org/wordprocessingml/2006/main" xmlns:w14="http://schemas.microsoft.com/office/word/2010/wordml" xmlns:w15="http://schemas.microsoft.com/office/word/2012/wordml" xmlns:w16cex="http://schemas.microsoft.com/office/word/2018/wordml/cex" xmlns:w16cid="http://schemas.microsoft.com/office/word/2016/wordml/cid" xmlns:w16="http://schemas.microsoft.com/office/word/2018/wordml" xmlns:w16sdtdh="http://schemas.microsoft.com/office/word/2020/wordml/sdtdatahash" xmlns:w16se="http://schemas.microsoft.com/office/word/2015/wordml/symex" xmlns:wpg="http://schemas.microsoft.com/office/word/2010/wordprocessingGroup" xmlns:wpi="http://schemas.microsoft.com/office/word/2010/wordprocessingInk" xmlns:wne="http://schemas.microsoft.com/office/word/2006/wordml" xmlns:wps="http://schemas.microsoft.com/office/word/2010/wordprocessingShape" mc:Ignorable="w14 w15 w16se w16cid w16 w16cex w16sdtdh wp14">
-  <w:tbl>
-    <w:tblPr>
-      <w:tblW w:w="0" w:type="auto"/>
-      <w:tblLayout w:type="fixed"/>
-      <w:tblLook w:val="06A0" w:firstRow="1" w:lastRow="0" w:firstColumn="1" w:lastColumn="0" w:noHBand="1" w:noVBand="1"/>
-    </w:tblPr>
-    <w:tblGrid>
-      <w:gridCol w:w="2830"/>
-      <w:gridCol w:w="2830"/>
-      <w:gridCol w:w="2830"/>
-    </w:tblGrid>
-    <w:tr>
-      <w:trPr>
-        <w:trHeight w:val="300"/>
-      </w:trPr>
-      <w:tc>
-        <w:tcPr>
-          <w:tcW w:w="2830" w:type="dxa"/>
-        </w:tcPr>
-        <w:p>
-          <w:pPr>
-            <w:pStyle w:val="Kopfzeile"/>
-            <w:ind w:left="-115"/>
-            <w:jc w:val="left"/>
-          </w:pPr>
-        </w:p>
-      </w:tc>
-      <w:tc>
-        <w:tcPr>
-          <w:tcW w:w="2830" w:type="dxa"/>
-        </w:tcPr>
-        <w:p>
-          <w:pPr>
-            <w:pStyle w:val="Kopfzeile"/>
-            <w:jc w:val="center"/>
-          </w:pPr>
-        </w:p>
-      </w:tc>
-      <w:tc>
-        <w:tcPr>
-          <w:tcW w:w="2830" w:type="dxa"/>
-        </w:tcPr>
-        <w:p>
-          <w:pPr>
-            <w:pStyle w:val="Kopfzeile"/>
-            <w:ind w:right="-115"/>
-          </w:pPr>
-        </w:p>
-      </w:tc>
-    </w:tr>
-  </w:tbl>
+<w:hdr xmlns:wpc="http://schemas.microsoft.com/office/word/2010/wordprocessingCanvas" xmlns:cx="http://schemas.microsoft.com/office/drawing/2014/chartex" xmlns:cx1="http://schemas.microsoft.com/office/drawing/2015/9/8/chartex" xmlns:cx2="http://schemas.microsoft.com/office/drawing/2015/10/21/chartex" xmlns:cx3="http://schemas.microsoft.com/office/drawing/2016/5/9/chartex" xmlns:cx4="http://schemas.microsoft.com/office/drawing/2016/5/10/chartex" xmlns:cx5="http://schemas.microsoft.com/office/drawing/2016/5/11/chartex" xmlns:cx6="http://schemas.microsoft.com/office/drawing/2016/5/12/chartex" xmlns:cx7="http://schemas.microsoft.com/office/drawing/2016/5/13/chartex" xmlns:cx8="http://schemas.microsoft.com/office/drawing/2016/5/14/chartex" xmlns:mc="http://schemas.openxmlformats.org/markup-compatibility/2006" xmlns:aink="http://schemas.microsoft.com/office/drawing/2016/ink" xmlns:am3d="http://schemas.microsoft.com/office/drawing/2017/model3d" xmlns:o="urn:schemas-microsoft-com:office:office" xmlns:oel="http://schemas.microsoft.com/office/2019/extlst" xmlns:r="http://schemas.openxmlformats.org/officeDocument/2006/relationships" xmlns:m="http://schemas.openxmlformats.org/officeDocument/2006/math" xmlns:v="urn:schemas-microsoft-com:vml" xmlns:wp14="http://schemas.microsoft.com/office/word/2010/wordprocessingDrawing" xmlns:wp="http://schemas.openxmlformats.org/drawingml/2006/wordprocessingDrawing" xmlns:w10="urn:schemas-microsoft-com:office:word" xmlns:w="http://schemas.openxmlformats.org/wordprocessingml/2006/main" xmlns:w14="http://schemas.microsoft.com/office/word/2010/wordml" xmlns:w15="http://schemas.microsoft.com/office/word/2012/wordml" xmlns:w16cex="http://schemas.microsoft.com/office/word/2018/wordml/cex" xmlns:w16cid="http://schemas.microsoft.com/office/word/2016/wordml/cid" xmlns:w16="http://schemas.microsoft.com/office/word/2018/wordml" xmlns:w16du="http://schemas.microsoft.com/office/word/2023/wordml/word16du" xmlns:w16sdtdh="http://schemas.microsoft.com/office/word/2020/wordml/sdtdatahash" xmlns:w16sdtfl="http://schemas.microsoft.com/office/word/2024/wordml/sdtformatlock" xmlns:w16se="http://schemas.microsoft.com/office/word/2015/wordml/symex" xmlns:wpg="http://schemas.microsoft.com/office/word/2010/wordprocessingGroup" xmlns:wpi="http://schemas.microsoft.com/office/word/2010/wordprocessingInk" xmlns:wne="http://schemas.microsoft.com/office/word/2006/wordml" xmlns:wps="http://schemas.microsoft.com/office/word/2010/wordprocessingShape" mc:Ignorable="w14 w15 w16se w16cid w16 w16cex w16sdtdh w16sdtfl w16du wp14">
   <w:p>
     <w:pPr>
-      <w:pStyle w:val="Kopfzeile"/>
-    </w:pPr>
-  </w:p>
-</w:hdr>
-</file>
-
-<file path=word/header2.xml><?xml version="1.0" encoding="utf-8"?>
-<w:hdr xmlns:wpc="http://schemas.microsoft.com/office/word/2010/wordprocessingCanvas" xmlns:cx="http://schemas.microsoft.com/office/drawing/2014/chartex" xmlns:cx1="http://schemas.microsoft.com/office/drawing/2015/9/8/chartex" xmlns:cx2="http://schemas.microsoft.com/office/drawing/2015/10/21/chartex" xmlns:cx3="http://schemas.microsoft.com/office/drawing/2016/5/9/chartex" xmlns:cx4="http://schemas.microsoft.com/office/drawing/2016/5/10/chartex" xmlns:cx5="http://schemas.microsoft.com/office/drawing/2016/5/11/chartex" xmlns:cx6="http://schemas.microsoft.com/office/drawing/2016/5/12/chartex" xmlns:cx7="http://schemas.microsoft.com/office/drawing/2016/5/13/chartex" xmlns:cx8="http://schemas.microsoft.com/office/drawing/2016/5/14/chartex" xmlns:mc="http://schemas.openxmlformats.org/markup-compatibility/2006" xmlns:aink="http://schemas.microsoft.com/office/drawing/2016/ink" xmlns:am3d="http://schemas.microsoft.com/office/drawing/2017/model3d" xmlns:o="urn:schemas-microsoft-com:office:office" xmlns:oel="http://schemas.microsoft.com/office/2019/extlst" xmlns:r="http://schemas.openxmlformats.org/officeDocument/2006/relationships" xmlns:m="http://schemas.openxmlformats.org/officeDocument/2006/math" xmlns:v="urn:schemas-microsoft-com:vml" xmlns:wp14="http://schemas.microsoft.com/office/word/2010/wordprocessingDrawing" xmlns:wp="http://schemas.openxmlformats.org/drawingml/2006/wordprocessingDrawing" xmlns:w10="urn:schemas-microsoft-com:office:word" xmlns:w="http://schemas.openxmlformats.org/wordprocessingml/2006/main" xmlns:w14="http://schemas.microsoft.com/office/word/2010/wordml" xmlns:w15="http://schemas.microsoft.com/office/word/2012/wordml" xmlns:w16cex="http://schemas.microsoft.com/office/word/2018/wordml/cex" xmlns:w16cid="http://schemas.microsoft.com/office/word/2016/wordml/cid" xmlns:w16="http://schemas.microsoft.com/office/word/2018/wordml" xmlns:w16sdtdh="http://schemas.microsoft.com/office/word/2020/wordml/sdtdatahash" xmlns:w16se="http://schemas.microsoft.com/office/word/2015/wordml/symex" xmlns:wpg="http://schemas.microsoft.com/office/word/2010/wordprocessingGroup" xmlns:wpi="http://schemas.microsoft.com/office/word/2010/wordprocessingInk" xmlns:wne="http://schemas.microsoft.com/office/word/2006/wordml" xmlns:wps="http://schemas.microsoft.com/office/word/2010/wordprocessingShape" mc:Ignorable="w14 w15 w16se w16cid w16 w16cex w16sdtdh wp14">
-  <w:p>
-    <w:pPr>
-      <w:pStyle w:val="Kopfzeile"/>
+      <w:pStyle w:val="Header"/>
       <w:rPr>
         <w:lang w:val="de-CH"/>
       </w:rPr>
@@ -617,11 +518,11 @@
 </w:hdr>
 </file>
 
-<file path=word/header3.xml><?xml version="1.0" encoding="utf-8"?>
-<w:hdr xmlns:wpc="http://schemas.microsoft.com/office/word/2010/wordprocessingCanvas" xmlns:cx="http://schemas.microsoft.com/office/drawing/2014/chartex" xmlns:cx1="http://schemas.microsoft.com/office/drawing/2015/9/8/chartex" xmlns:cx2="http://schemas.microsoft.com/office/drawing/2015/10/21/chartex" xmlns:cx3="http://schemas.microsoft.com/office/drawing/2016/5/9/chartex" xmlns:cx4="http://schemas.microsoft.com/office/drawing/2016/5/10/chartex" xmlns:cx5="http://schemas.microsoft.com/office/drawing/2016/5/11/chartex" xmlns:cx6="http://schemas.microsoft.com/office/drawing/2016/5/12/chartex" xmlns:cx7="http://schemas.microsoft.com/office/drawing/2016/5/13/chartex" xmlns:cx8="http://schemas.microsoft.com/office/drawing/2016/5/14/chartex" xmlns:mc="http://schemas.openxmlformats.org/markup-compatibility/2006" xmlns:aink="http://schemas.microsoft.com/office/drawing/2016/ink" xmlns:am3d="http://schemas.microsoft.com/office/drawing/2017/model3d" xmlns:o="urn:schemas-microsoft-com:office:office" xmlns:oel="http://schemas.microsoft.com/office/2019/extlst" xmlns:r="http://schemas.openxmlformats.org/officeDocument/2006/relationships" xmlns:m="http://schemas.openxmlformats.org/officeDocument/2006/math" xmlns:v="urn:schemas-microsoft-com:vml" xmlns:wp14="http://schemas.microsoft.com/office/word/2010/wordprocessingDrawing" xmlns:wp="http://schemas.openxmlformats.org/drawingml/2006/wordprocessingDrawing" xmlns:w10="urn:schemas-microsoft-com:office:word" xmlns:w="http://schemas.openxmlformats.org/wordprocessingml/2006/main" xmlns:w14="http://schemas.microsoft.com/office/word/2010/wordml" xmlns:w15="http://schemas.microsoft.com/office/word/2012/wordml" xmlns:w16cex="http://schemas.microsoft.com/office/word/2018/wordml/cex" xmlns:w16cid="http://schemas.microsoft.com/office/word/2016/wordml/cid" xmlns:w16="http://schemas.microsoft.com/office/word/2018/wordml" xmlns:w16sdtdh="http://schemas.microsoft.com/office/word/2020/wordml/sdtdatahash" xmlns:w16se="http://schemas.microsoft.com/office/word/2015/wordml/symex" xmlns:wpg="http://schemas.microsoft.com/office/word/2010/wordprocessingGroup" xmlns:wpi="http://schemas.microsoft.com/office/word/2010/wordprocessingInk" xmlns:wne="http://schemas.microsoft.com/office/word/2006/wordml" xmlns:wps="http://schemas.microsoft.com/office/word/2010/wordprocessingShape" mc:Ignorable="w14 w15 w16se w16cid w16 w16cex w16sdtdh wp14">
+<file path=word/header2.xml><?xml version="1.0" encoding="utf-8"?>
+<w:hdr xmlns:wpc="http://schemas.microsoft.com/office/word/2010/wordprocessingCanvas" xmlns:cx="http://schemas.microsoft.com/office/drawing/2014/chartex" xmlns:cx1="http://schemas.microsoft.com/office/drawing/2015/9/8/chartex" xmlns:cx2="http://schemas.microsoft.com/office/drawing/2015/10/21/chartex" xmlns:cx3="http://schemas.microsoft.com/office/drawing/2016/5/9/chartex" xmlns:cx4="http://schemas.microsoft.com/office/drawing/2016/5/10/chartex" xmlns:cx5="http://schemas.microsoft.com/office/drawing/2016/5/11/chartex" xmlns:cx6="http://schemas.microsoft.com/office/drawing/2016/5/12/chartex" xmlns:cx7="http://schemas.microsoft.com/office/drawing/2016/5/13/chartex" xmlns:cx8="http://schemas.microsoft.com/office/drawing/2016/5/14/chartex" xmlns:mc="http://schemas.openxmlformats.org/markup-compatibility/2006" xmlns:aink="http://schemas.microsoft.com/office/drawing/2016/ink" xmlns:am3d="http://schemas.microsoft.com/office/drawing/2017/model3d" xmlns:o="urn:schemas-microsoft-com:office:office" xmlns:oel="http://schemas.microsoft.com/office/2019/extlst" xmlns:r="http://schemas.openxmlformats.org/officeDocument/2006/relationships" xmlns:m="http://schemas.openxmlformats.org/officeDocument/2006/math" xmlns:v="urn:schemas-microsoft-com:vml" xmlns:wp14="http://schemas.microsoft.com/office/word/2010/wordprocessingDrawing" xmlns:wp="http://schemas.openxmlformats.org/drawingml/2006/wordprocessingDrawing" xmlns:w10="urn:schemas-microsoft-com:office:word" xmlns:w="http://schemas.openxmlformats.org/wordprocessingml/2006/main" xmlns:w14="http://schemas.microsoft.com/office/word/2010/wordml" xmlns:w15="http://schemas.microsoft.com/office/word/2012/wordml" xmlns:w16cex="http://schemas.microsoft.com/office/word/2018/wordml/cex" xmlns:w16cid="http://schemas.microsoft.com/office/word/2016/wordml/cid" xmlns:w16="http://schemas.microsoft.com/office/word/2018/wordml" xmlns:w16du="http://schemas.microsoft.com/office/word/2023/wordml/word16du" xmlns:w16sdtdh="http://schemas.microsoft.com/office/word/2020/wordml/sdtdatahash" xmlns:w16sdtfl="http://schemas.microsoft.com/office/word/2024/wordml/sdtformatlock" xmlns:w16se="http://schemas.microsoft.com/office/word/2015/wordml/symex" xmlns:wpg="http://schemas.microsoft.com/office/word/2010/wordprocessingGroup" xmlns:wpi="http://schemas.microsoft.com/office/word/2010/wordprocessingInk" xmlns:wne="http://schemas.microsoft.com/office/word/2006/wordml" xmlns:wps="http://schemas.microsoft.com/office/word/2010/wordprocessingShape" mc:Ignorable="w14 w15 w16se w16cid w16 w16cex w16sdtdh w16sdtfl w16du wp14">
   <w:p>
     <w:pPr>
-      <w:pStyle w:val="Kopfzeile"/>
+      <w:pStyle w:val="Header"/>
     </w:pPr>
     <w:r>
       <w:t>Kurztitel der Arbeit</w:t>
@@ -631,7 +532,7 @@
 </file>
 
 <file path=word/numbering.xml><?xml version="1.0" encoding="utf-8"?>
-<w:numbering xmlns:aink="http://schemas.microsoft.com/office/drawing/2016/ink" xmlns:am3d="http://schemas.microsoft.com/office/drawing/2017/model3d" xmlns:cx="http://schemas.microsoft.com/office/drawing/2014/chartex" xmlns:cx1="http://schemas.microsoft.com/office/drawing/2015/9/8/chartex" xmlns:cx2="http://schemas.microsoft.com/office/drawing/2015/10/21/chartex" xmlns:cx3="http://schemas.microsoft.com/office/drawing/2016/5/9/chartex" xmlns:cx4="http://schemas.microsoft.com/office/drawing/2016/5/10/chartex" xmlns:cx5="http://schemas.microsoft.com/office/drawing/2016/5/11/chartex" xmlns:cx6="http://schemas.microsoft.com/office/drawing/2016/5/12/chartex" xmlns:cx7="http://schemas.microsoft.com/office/drawing/2016/5/13/chartex" xmlns:cx8="http://schemas.microsoft.com/office/drawing/2016/5/14/chartex" xmlns:m="http://schemas.openxmlformats.org/officeDocument/2006/math" xmlns:mc="http://schemas.openxmlformats.org/markup-compatibility/2006" xmlns:o="urn:schemas-microsoft-com:office:office" xmlns:oel="http://schemas.microsoft.com/office/2019/extlst" xmlns:r="http://schemas.openxmlformats.org/officeDocument/2006/relationships" xmlns:v="urn:schemas-microsoft-com:vml" xmlns:w="http://schemas.openxmlformats.org/wordprocessingml/2006/main" xmlns:w10="urn:schemas-microsoft-com:office:word" xmlns:w14="http://schemas.microsoft.com/office/word/2010/wordml" xmlns:w15="http://schemas.microsoft.com/office/word/2012/wordml" xmlns:w16="http://schemas.microsoft.com/office/word/2018/wordml" xmlns:w16cex="http://schemas.microsoft.com/office/word/2018/wordml/cex" xmlns:w16cid="http://schemas.microsoft.com/office/word/2016/wordml/cid" xmlns:w16sdtdh="http://schemas.microsoft.com/office/word/2020/wordml/sdtdatahash" xmlns:w16se="http://schemas.microsoft.com/office/word/2015/wordml/symex" xmlns:wne="http://schemas.microsoft.com/office/word/2006/wordml" xmlns:wp="http://schemas.openxmlformats.org/drawingml/2006/wordprocessingDrawing" xmlns:wp14="http://schemas.microsoft.com/office/word/2010/wordprocessingDrawing" xmlns:wpc="http://schemas.microsoft.com/office/word/2010/wordprocessingCanvas" xmlns:wpg="http://schemas.microsoft.com/office/word/2010/wordprocessingGroup" xmlns:wpi="http://schemas.microsoft.com/office/word/2010/wordprocessingInk" xmlns:wps="http://schemas.microsoft.com/office/word/2010/wordprocessingShape" mc:Ignorable="w14 w15 w16se w16cid w16 w16cex w16sdtdh wp14">
+<w:numbering xmlns:aink="http://schemas.microsoft.com/office/drawing/2016/ink" xmlns:am3d="http://schemas.microsoft.com/office/drawing/2017/model3d" xmlns:cx="http://schemas.microsoft.com/office/drawing/2014/chartex" xmlns:cx1="http://schemas.microsoft.com/office/drawing/2015/9/8/chartex" xmlns:cx2="http://schemas.microsoft.com/office/drawing/2015/10/21/chartex" xmlns:cx3="http://schemas.microsoft.com/office/drawing/2016/5/9/chartex" xmlns:cx4="http://schemas.microsoft.com/office/drawing/2016/5/10/chartex" xmlns:cx5="http://schemas.microsoft.com/office/drawing/2016/5/11/chartex" xmlns:cx6="http://schemas.microsoft.com/office/drawing/2016/5/12/chartex" xmlns:cx7="http://schemas.microsoft.com/office/drawing/2016/5/13/chartex" xmlns:cx8="http://schemas.microsoft.com/office/drawing/2016/5/14/chartex" xmlns:m="http://schemas.openxmlformats.org/officeDocument/2006/math" xmlns:mc="http://schemas.openxmlformats.org/markup-compatibility/2006" xmlns:o="urn:schemas-microsoft-com:office:office" xmlns:oel="http://schemas.microsoft.com/office/2019/extlst" xmlns:r="http://schemas.openxmlformats.org/officeDocument/2006/relationships" xmlns:v="urn:schemas-microsoft-com:vml" xmlns:w="http://schemas.openxmlformats.org/wordprocessingml/2006/main" xmlns:w10="urn:schemas-microsoft-com:office:word" xmlns:w14="http://schemas.microsoft.com/office/word/2010/wordml" xmlns:w15="http://schemas.microsoft.com/office/word/2012/wordml" xmlns:w16="http://schemas.microsoft.com/office/word/2018/wordml" xmlns:w16cex="http://schemas.microsoft.com/office/word/2018/wordml/cex" xmlns:w16cid="http://schemas.microsoft.com/office/word/2016/wordml/cid" xmlns:w16du="http://schemas.microsoft.com/office/word/2023/wordml/word16du" xmlns:w16sdtdh="http://schemas.microsoft.com/office/word/2020/wordml/sdtdatahash" xmlns:w16sdtfl="http://schemas.microsoft.com/office/word/2024/wordml/sdtformatlock" xmlns:w16se="http://schemas.microsoft.com/office/word/2015/wordml/symex" xmlns:wne="http://schemas.microsoft.com/office/word/2006/wordml" xmlns:wp="http://schemas.openxmlformats.org/drawingml/2006/wordprocessingDrawing" xmlns:wp14="http://schemas.microsoft.com/office/word/2010/wordprocessingDrawing" xmlns:wpc="http://schemas.microsoft.com/office/word/2010/wordprocessingCanvas" xmlns:wpg="http://schemas.microsoft.com/office/word/2010/wordprocessingGroup" xmlns:wpi="http://schemas.microsoft.com/office/word/2010/wordprocessingInk" xmlns:wps="http://schemas.microsoft.com/office/word/2010/wordprocessingShape" mc:Ignorable="w14 w15 w16se w16cid w16 w16cex w16sdtdh w16sdtfl w16du wp14">
   <w:abstractNum w15:restartNumberingAfterBreak="0" w:abstractNumId="0">
     <w:nsid w:val="FFFFFF7C"/>
     <w:multiLevelType w:val="singleLevel"/>
@@ -787,7 +688,7 @@
     <w:lvl w:ilvl="0">
       <w:start w:val="1"/>
       <w:numFmt w:val="decimal"/>
-      <w:pStyle w:val="Listennummer"/>
+      <w:pStyle w:val="ListNumber"/>
       <w:lvlText w:val="%1."/>
       <w:lvlJc w:val="left"/>
       <w:pPr>
@@ -805,7 +706,7 @@
     <w:lvl w:ilvl="0">
       <w:start w:val="1"/>
       <w:numFmt w:val="bullet"/>
-      <w:pStyle w:val="Aufzhlungszeichen"/>
+      <w:pStyle w:val="ListBullet"/>
       <w:lvlText w:val=""/>
       <w:lvlJc w:val="left"/>
       <w:pPr>
@@ -2561,7 +2462,7 @@
     <w:lvl w:ilvl="0">
       <w:start w:val="1"/>
       <w:numFmt w:val="decimal"/>
-      <w:pStyle w:val="berschrift1"/>
+      <w:pStyle w:val="Heading1"/>
       <w:lvlText w:val="%1"/>
       <w:lvlJc w:val="left"/>
       <w:pPr>
@@ -2574,7 +2475,7 @@
     <w:lvl w:ilvl="1">
       <w:start w:val="1"/>
       <w:numFmt w:val="decimal"/>
-      <w:pStyle w:val="berschrift2"/>
+      <w:pStyle w:val="Heading2"/>
       <w:lvlText w:val="%1.%2"/>
       <w:lvlJc w:val="left"/>
       <w:pPr>
@@ -2587,7 +2488,7 @@
     <w:lvl w:ilvl="2">
       <w:start w:val="1"/>
       <w:numFmt w:val="decimal"/>
-      <w:pStyle w:val="berschrift3"/>
+      <w:pStyle w:val="Heading3"/>
       <w:lvlText w:val="%1.%2.%3"/>
       <w:lvlJc w:val="left"/>
       <w:pPr>
@@ -2600,7 +2501,7 @@
     <w:lvl w:ilvl="3">
       <w:start w:val="1"/>
       <w:numFmt w:val="decimal"/>
-      <w:pStyle w:val="berschrift4"/>
+      <w:pStyle w:val="Heading4"/>
       <w:lvlText w:val="%1.%2.%3.%4"/>
       <w:lvlJc w:val="left"/>
       <w:pPr>
@@ -2613,7 +2514,7 @@
     <w:lvl w:ilvl="4">
       <w:start w:val="1"/>
       <w:numFmt w:val="decimal"/>
-      <w:pStyle w:val="berschrift5"/>
+      <w:pStyle w:val="Heading5"/>
       <w:lvlText w:val="%1.%2.%3.%4.%5"/>
       <w:lvlJc w:val="left"/>
       <w:pPr>
@@ -2626,7 +2527,7 @@
     <w:lvl w:ilvl="5">
       <w:start w:val="1"/>
       <w:numFmt w:val="decimal"/>
-      <w:pStyle w:val="berschrift6"/>
+      <w:pStyle w:val="Heading6"/>
       <w:lvlText w:val="%1.%2.%3.%4.%5.%6"/>
       <w:lvlJc w:val="left"/>
       <w:pPr>
@@ -2639,7 +2540,7 @@
     <w:lvl w:ilvl="6">
       <w:start w:val="1"/>
       <w:numFmt w:val="decimal"/>
-      <w:pStyle w:val="berschrift7"/>
+      <w:pStyle w:val="Heading7"/>
       <w:lvlText w:val="%1.%2.%3.%4.%5.%6.%7"/>
       <w:lvlJc w:val="left"/>
       <w:pPr>
@@ -2652,7 +2553,7 @@
     <w:lvl w:ilvl="7">
       <w:start w:val="1"/>
       <w:numFmt w:val="decimal"/>
-      <w:pStyle w:val="berschrift8"/>
+      <w:pStyle w:val="Heading8"/>
       <w:lvlText w:val="%1.%2.%3.%4.%5.%6.%7.%8"/>
       <w:lvlJc w:val="left"/>
       <w:pPr>
@@ -2665,7 +2566,7 @@
     <w:lvl w:ilvl="8">
       <w:start w:val="1"/>
       <w:numFmt w:val="decimal"/>
-      <w:pStyle w:val="berschrift9"/>
+      <w:pStyle w:val="Heading9"/>
       <w:lvlText w:val="%1.%2.%3.%4.%5.%6.%7.%8.%9"/>
       <w:lvlJc w:val="left"/>
       <w:pPr>
@@ -3342,7 +3243,7 @@
 </file>
 
 <file path=word/styles.xml><?xml version="1.0" encoding="utf-8"?>
-<w:styles xmlns:mc="http://schemas.openxmlformats.org/markup-compatibility/2006" xmlns:r="http://schemas.openxmlformats.org/officeDocument/2006/relationships" xmlns:w="http://schemas.openxmlformats.org/wordprocessingml/2006/main" xmlns:w14="http://schemas.microsoft.com/office/word/2010/wordml" xmlns:w15="http://schemas.microsoft.com/office/word/2012/wordml" xmlns:w16="http://schemas.microsoft.com/office/word/2018/wordml" xmlns:w16cex="http://schemas.microsoft.com/office/word/2018/wordml/cex" xmlns:w16cid="http://schemas.microsoft.com/office/word/2016/wordml/cid" xmlns:w16sdtdh="http://schemas.microsoft.com/office/word/2020/wordml/sdtdatahash" xmlns:w16se="http://schemas.microsoft.com/office/word/2015/wordml/symex" mc:Ignorable="w14 w15 w16se w16cid w16 w16cex w16sdtdh">
+<w:styles xmlns:mc="http://schemas.openxmlformats.org/markup-compatibility/2006" xmlns:r="http://schemas.openxmlformats.org/officeDocument/2006/relationships" xmlns:w="http://schemas.openxmlformats.org/wordprocessingml/2006/main" xmlns:w14="http://schemas.microsoft.com/office/word/2010/wordml" xmlns:w15="http://schemas.microsoft.com/office/word/2012/wordml" xmlns:w16="http://schemas.microsoft.com/office/word/2018/wordml" xmlns:w16cex="http://schemas.microsoft.com/office/word/2018/wordml/cex" xmlns:w16cid="http://schemas.microsoft.com/office/word/2016/wordml/cid" xmlns:w16du="http://schemas.microsoft.com/office/word/2023/wordml/word16du" xmlns:w16sdtdh="http://schemas.microsoft.com/office/word/2020/wordml/sdtdatahash" xmlns:w16sdtfl="http://schemas.microsoft.com/office/word/2024/wordml/sdtformatlock" xmlns:w16se="http://schemas.microsoft.com/office/word/2015/wordml/symex" mc:Ignorable="w14 w15 w16se w16cid w16 w16cex w16sdtdh w16sdtfl w16du">
   <w:docDefaults>
     <w:rPrDefault>
       <w:rPr>
@@ -3732,7 +3633,7 @@
     <w:lsdException w:name="Unresolved Mention" w:semiHidden="1" w:unhideWhenUsed="1"/>
     <w:lsdException w:name="Smart Link" w:semiHidden="1" w:unhideWhenUsed="1"/>
   </w:latentStyles>
-  <w:style w:default="1" w:styleId="Standard" w:type="paragraph">
+  <w:style w:default="1" w:styleId="Normal" w:type="paragraph">
     <w:name w:val="Normal"/>
     <w:qFormat/>
     <w:rsid w:val="000357FF"/>
@@ -3744,11 +3645,11 @@
       <w:lang w:eastAsia="de-DE" w:val="de-LI"/>
     </w:rPr>
   </w:style>
-  <w:style w:styleId="berschrift1" w:type="paragraph">
+  <w:style w:styleId="Heading1" w:type="paragraph">
     <w:name w:val="heading 1"/>
-    <w:basedOn w:val="Standard"/>
-    <w:next w:val="Textkrper"/>
-    <w:link w:val="berschrift1Zchn"/>
+    <w:basedOn w:val="Normal"/>
+    <w:next w:val="BodyText"/>
+    <w:link w:val="Heading1Char"/>
     <w:qFormat/>
     <w:rsid w:val="00861164"/>
     <w:pPr>
@@ -3775,10 +3676,10 @@
       <w:lang w:val="de-CH"/>
     </w:rPr>
   </w:style>
-  <w:style w:styleId="berschrift2" w:type="paragraph">
+  <w:style w:styleId="Heading2" w:type="paragraph">
     <w:name w:val="heading 2"/>
-    <w:basedOn w:val="Textkrper"/>
-    <w:next w:val="Textkrper"/>
+    <w:basedOn w:val="BodyText"/>
+    <w:next w:val="BodyText"/>
     <w:qFormat/>
     <w:rsid w:val="00861164"/>
     <w:pPr>
@@ -3803,10 +3704,10 @@
       <w:szCs w:val="28"/>
     </w:rPr>
   </w:style>
-  <w:style w:styleId="berschrift3" w:type="paragraph">
+  <w:style w:styleId="Heading3" w:type="paragraph">
     <w:name w:val="heading 3"/>
-    <w:basedOn w:val="Textkrper"/>
-    <w:next w:val="Textkrper"/>
+    <w:basedOn w:val="BodyText"/>
+    <w:next w:val="BodyText"/>
     <w:qFormat/>
     <w:rsid w:val="00861164"/>
     <w:pPr>
@@ -3829,10 +3730,10 @@
       <w:szCs w:val="28"/>
     </w:rPr>
   </w:style>
-  <w:style w:styleId="berschrift4" w:type="paragraph">
+  <w:style w:styleId="Heading4" w:type="paragraph">
     <w:name w:val="heading 4"/>
-    <w:basedOn w:val="Standard"/>
-    <w:next w:val="Standard"/>
+    <w:basedOn w:val="Normal"/>
+    <w:next w:val="Normal"/>
     <w:pPr>
       <w:keepNext/>
       <w:numPr>
@@ -3849,10 +3750,10 @@
       <w:szCs w:val="28"/>
     </w:rPr>
   </w:style>
-  <w:style w:styleId="berschrift5" w:type="paragraph">
+  <w:style w:styleId="Heading5" w:type="paragraph">
     <w:name w:val="heading 5"/>
-    <w:basedOn w:val="Standard"/>
-    <w:next w:val="Standard"/>
+    <w:basedOn w:val="Normal"/>
+    <w:next w:val="Normal"/>
     <w:pPr>
       <w:numPr>
         <w:ilvl w:val="4"/>
@@ -3870,10 +3771,10 @@
       <w:szCs w:val="26"/>
     </w:rPr>
   </w:style>
-  <w:style w:styleId="berschrift6" w:type="paragraph">
+  <w:style w:styleId="Heading6" w:type="paragraph">
     <w:name w:val="heading 6"/>
-    <w:basedOn w:val="Standard"/>
-    <w:next w:val="Standard"/>
+    <w:basedOn w:val="Normal"/>
+    <w:next w:val="Normal"/>
     <w:pPr>
       <w:numPr>
         <w:ilvl w:val="5"/>
@@ -3888,10 +3789,10 @@
       <w:szCs w:val="22"/>
     </w:rPr>
   </w:style>
-  <w:style w:styleId="berschrift7" w:type="paragraph">
+  <w:style w:styleId="Heading7" w:type="paragraph">
     <w:name w:val="heading 7"/>
-    <w:basedOn w:val="Standard"/>
-    <w:next w:val="Standard"/>
+    <w:basedOn w:val="Normal"/>
+    <w:next w:val="Normal"/>
     <w:pPr>
       <w:numPr>
         <w:ilvl w:val="6"/>
@@ -3901,10 +3802,10 @@
       <w:outlineLvl w:val="6"/>
     </w:pPr>
   </w:style>
-  <w:style w:styleId="berschrift8" w:type="paragraph">
+  <w:style w:styleId="Heading8" w:type="paragraph">
     <w:name w:val="heading 8"/>
-    <w:basedOn w:val="Standard"/>
-    <w:next w:val="Standard"/>
+    <w:basedOn w:val="Normal"/>
+    <w:next w:val="Normal"/>
     <w:pPr>
       <w:numPr>
         <w:ilvl w:val="7"/>
@@ -3918,10 +3819,10 @@
       <w:iCs/>
     </w:rPr>
   </w:style>
-  <w:style w:styleId="berschrift9" w:type="paragraph">
+  <w:style w:styleId="Heading9" w:type="paragraph">
     <w:name w:val="heading 9"/>
-    <w:basedOn w:val="Standard"/>
-    <w:next w:val="Standard"/>
+    <w:basedOn w:val="Normal"/>
+    <w:next w:val="Normal"/>
     <w:pPr>
       <w:numPr>
         <w:ilvl w:val="8"/>
@@ -3935,13 +3836,13 @@
       <w:szCs w:val="22"/>
     </w:rPr>
   </w:style>
-  <w:style w:default="1" w:styleId="Absatz-Standardschriftart" w:type="character">
+  <w:style w:default="1" w:styleId="DefaultParagraphFont" w:type="character">
     <w:name w:val="Default Paragraph Font"/>
     <w:uiPriority w:val="1"/>
     <w:semiHidden/>
     <w:unhideWhenUsed/>
   </w:style>
-  <w:style w:default="1" w:styleId="NormaleTabelle" w:type="table">
+  <w:style w:default="1" w:styleId="TableNormal" w:type="table">
     <w:name w:val="Normal Table"/>
     <w:uiPriority w:val="99"/>
     <w:semiHidden/>
@@ -3956,16 +3857,16 @@
       </w:tblCellMar>
     </w:tblPr>
   </w:style>
-  <w:style w:default="1" w:styleId="KeineListe" w:type="numbering">
+  <w:style w:default="1" w:styleId="NoList" w:type="numbering">
     <w:name w:val="No List"/>
     <w:uiPriority w:val="99"/>
     <w:semiHidden/>
     <w:unhideWhenUsed/>
   </w:style>
-  <w:style w:customStyle="1" w:styleId="berschrift1Zchn" w:type="character">
-    <w:name w:val="Überschrift 1 Zchn"/>
-    <w:basedOn w:val="Absatz-Standardschriftart"/>
-    <w:link w:val="berschrift1"/>
+  <w:style w:customStyle="1" w:styleId="Heading1Char" w:type="character">
+    <w:name w:val="Heading 1 Char"/>
+    <w:basedOn w:val="DefaultParagraphFont"/>
+    <w:link w:val="Heading1"/>
     <w:rsid w:val="00861164"/>
     <w:rPr>
       <w:rFonts w:cs="Arial"/>
@@ -3978,11 +3879,11 @@
       <w:lang w:eastAsia="de-DE"/>
     </w:rPr>
   </w:style>
-  <w:style w:styleId="Zitat" w:type="paragraph">
+  <w:style w:styleId="Quote" w:type="paragraph">
     <w:name w:val="Quote"/>
-    <w:basedOn w:val="Standard"/>
-    <w:next w:val="Standard"/>
-    <w:link w:val="ZitatZchn"/>
+    <w:basedOn w:val="Normal"/>
+    <w:next w:val="Normal"/>
+    <w:link w:val="QuoteChar"/>
     <w:uiPriority w:val="29"/>
     <w:qFormat/>
     <w:rsid w:val="00D93186"/>
@@ -3996,10 +3897,10 @@
       <w:color w:themeColor="text1" w:themeTint="BF" w:val="404040"/>
     </w:rPr>
   </w:style>
-  <w:style w:customStyle="1" w:styleId="ZitatZchn" w:type="character">
-    <w:name w:val="Zitat Zchn"/>
-    <w:basedOn w:val="Absatz-Standardschriftart"/>
-    <w:link w:val="Zitat"/>
+  <w:style w:customStyle="1" w:styleId="QuoteChar" w:type="character">
+    <w:name w:val="Quote Char"/>
+    <w:basedOn w:val="DefaultParagraphFont"/>
+    <w:link w:val="Quote"/>
     <w:uiPriority w:val="29"/>
     <w:rsid w:val="00D93186"/>
     <w:rPr>
@@ -4011,7 +3912,7 @@
   </w:style>
   <w:style w:customStyle="1" w:styleId="TBArtderArbeit" w:type="paragraph">
     <w:name w:val="TB_Art_der_Arbeit"/>
-    <w:basedOn w:val="Standard"/>
+    <w:basedOn w:val="Normal"/>
     <w:rsid w:val="0059372C"/>
     <w:rPr>
       <w:b/>
@@ -4019,9 +3920,9 @@
       <w:lang w:val="de-CH"/>
     </w:rPr>
   </w:style>
-  <w:style w:styleId="Kopfzeile" w:type="paragraph">
+  <w:style w:styleId="Header" w:type="paragraph">
     <w:name w:val="header"/>
-    <w:basedOn w:val="Standard"/>
+    <w:basedOn w:val="Normal"/>
     <w:qFormat/>
     <w:rsid w:val="001D21D0"/>
     <w:pPr>
@@ -4036,9 +3937,9 @@
       <w:sz w:val="18"/>
     </w:rPr>
   </w:style>
-  <w:style w:styleId="Fuzeile" w:type="paragraph">
+  <w:style w:styleId="Footer" w:type="paragraph">
     <w:name w:val="footer"/>
-    <w:basedOn w:val="Standard"/>
+    <w:basedOn w:val="Normal"/>
     <w:qFormat/>
     <w:pPr>
       <w:tabs>
@@ -4051,10 +3952,10 @@
       <w:sz w:val="16"/>
     </w:rPr>
   </w:style>
-  <w:style w:styleId="Textkrper" w:type="paragraph">
+  <w:style w:styleId="BodyText" w:type="paragraph">
     <w:name w:val="Body Text"/>
-    <w:basedOn w:val="Standard"/>
-    <w:link w:val="TextkrperZchn"/>
+    <w:basedOn w:val="Normal"/>
+    <w:link w:val="BodyTextChar"/>
     <w:rsid w:val="00336A23"/>
     <w:pPr>
       <w:jc w:val="both"/>
@@ -4063,9 +3964,9 @@
       <w:szCs w:val="22"/>
     </w:rPr>
   </w:style>
-  <w:style w:styleId="Seitenzahl" w:type="character">
+  <w:style w:styleId="PageNumber" w:type="character">
     <w:name w:val="page number"/>
-    <w:basedOn w:val="Absatz-Standardschriftart"/>
+    <w:basedOn w:val="DefaultParagraphFont"/>
     <w:rPr>
       <w:rFonts w:ascii="Arial" w:hAnsi="Arial"/>
       <w:sz w:val="16"/>
@@ -4073,17 +3974,17 @@
   </w:style>
   <w:style w:customStyle="1" w:styleId="Abbildung" w:type="paragraph">
     <w:name w:val="Abbildung"/>
-    <w:basedOn w:val="Standard"/>
+    <w:basedOn w:val="Normal"/>
     <w:rsid w:val="0059372C"/>
     <w:rPr>
       <w:sz w:val="18"/>
       <w:lang w:val="de-CH"/>
     </w:rPr>
   </w:style>
-  <w:style w:styleId="Verzeichnis2" w:type="paragraph">
+  <w:style w:styleId="TOC2" w:type="paragraph">
     <w:name w:val="toc 2"/>
-    <w:basedOn w:val="Standard"/>
-    <w:next w:val="Standard"/>
+    <w:basedOn w:val="Normal"/>
+    <w:next w:val="Normal"/>
     <w:uiPriority w:val="39"/>
     <w:pPr>
       <w:tabs>
@@ -4093,10 +3994,10 @@
       <w:ind w:left="720"/>
     </w:pPr>
   </w:style>
-  <w:style w:styleId="Verzeichnis1" w:type="paragraph">
+  <w:style w:styleId="TOC1" w:type="paragraph">
     <w:name w:val="toc 1"/>
-    <w:basedOn w:val="Standard"/>
-    <w:next w:val="Standard"/>
+    <w:basedOn w:val="Normal"/>
+    <w:next w:val="Normal"/>
     <w:uiPriority w:val="39"/>
     <w:pPr>
       <w:tabs>
@@ -4108,10 +4009,10 @@
       <w:b/>
     </w:rPr>
   </w:style>
-  <w:style w:styleId="Verzeichnis3" w:type="paragraph">
+  <w:style w:styleId="TOC3" w:type="paragraph">
     <w:name w:val="toc 3"/>
-    <w:basedOn w:val="Standard"/>
-    <w:next w:val="Standard"/>
+    <w:basedOn w:val="Normal"/>
+    <w:next w:val="Normal"/>
     <w:uiPriority w:val="39"/>
     <w:pPr>
       <w:tabs>
@@ -4124,7 +4025,7 @@
   </w:style>
   <w:style w:styleId="Hyperlink" w:type="character">
     <w:name w:val="Hyperlink"/>
-    <w:basedOn w:val="Absatz-Standardschriftart"/>
+    <w:basedOn w:val="DefaultParagraphFont"/>
     <w:uiPriority w:val="99"/>
     <w:rPr>
       <w:rFonts w:ascii="Arial" w:hAnsi="Arial"/>
@@ -4132,10 +4033,10 @@
       <w:u w:val="single"/>
     </w:rPr>
   </w:style>
-  <w:style w:styleId="Abbildungsverzeichnis" w:type="paragraph">
+  <w:style w:styleId="TableofFigures" w:type="paragraph">
     <w:name w:val="table of figures"/>
-    <w:basedOn w:val="Textkrper"/>
-    <w:next w:val="Standard"/>
+    <w:basedOn w:val="BodyText"/>
+    <w:next w:val="Normal"/>
     <w:uiPriority w:val="99"/>
     <w:pPr>
       <w:ind w:hanging="480" w:left="480"/>
@@ -4143,7 +4044,7 @@
   </w:style>
   <w:style w:customStyle="1" w:styleId="Tabelle" w:type="paragraph">
     <w:name w:val="Tabelle"/>
-    <w:basedOn w:val="Standard"/>
+    <w:basedOn w:val="Normal"/>
     <w:rsid w:val="0059372C"/>
     <w:rPr>
       <w:sz w:val="18"/>
@@ -4152,7 +4053,7 @@
   </w:style>
   <w:style w:customStyle="1" w:styleId="Inhaltsverzeichnis" w:type="paragraph">
     <w:name w:val="Inhaltsverzeichnis"/>
-    <w:basedOn w:val="Textkrper"/>
+    <w:basedOn w:val="BodyText"/>
     <w:rPr>
       <w:b/>
       <w:bCs/>
@@ -4161,9 +4062,9 @@
       <w:szCs w:val="28"/>
     </w:rPr>
   </w:style>
-  <w:style w:styleId="Literaturverzeichnis" w:type="paragraph">
+  <w:style w:styleId="Bibliography" w:type="paragraph">
     <w:name w:val="Bibliography"/>
-    <w:basedOn w:val="Textkrper"/>
+    <w:basedOn w:val="BodyText"/>
     <w:qFormat/>
     <w:rsid w:val="00520D17"/>
     <w:pPr>
@@ -4173,9 +4074,9 @@
       <w:szCs w:val="20"/>
     </w:rPr>
   </w:style>
-  <w:style w:styleId="Tabellenraster" w:type="table">
+  <w:style w:styleId="TableGrid" w:type="table">
     <w:name w:val="Table Grid"/>
-    <w:basedOn w:val="NormaleTabelle"/>
+    <w:basedOn w:val="TableNormal"/>
     <w:pPr>
       <w:spacing w:line="360" w:lineRule="auto"/>
     </w:pPr>
@@ -4192,7 +4093,7 @@
   </w:style>
   <w:style w:customStyle="1" w:styleId="TabelleInhalt" w:type="paragraph">
     <w:name w:val="Tabelle_Inhalt"/>
-    <w:basedOn w:val="Textkrper"/>
+    <w:basedOn w:val="BodyText"/>
     <w:qFormat/>
     <w:rsid w:val="00B374BB"/>
     <w:pPr>
@@ -4202,10 +4103,10 @@
       <w:sz w:val="20"/>
     </w:rPr>
   </w:style>
-  <w:style w:styleId="Sprechblasentext" w:type="paragraph">
+  <w:style w:styleId="BalloonText" w:type="paragraph">
     <w:name w:val="Balloon Text"/>
-    <w:basedOn w:val="Standard"/>
-    <w:link w:val="SprechblasentextZchn"/>
+    <w:basedOn w:val="Normal"/>
+    <w:link w:val="BalloonTextChar"/>
     <w:uiPriority w:val="99"/>
     <w:semiHidden/>
     <w:unhideWhenUsed/>
@@ -4218,10 +4119,10 @@
       <w:szCs w:val="16"/>
     </w:rPr>
   </w:style>
-  <w:style w:customStyle="1" w:styleId="SprechblasentextZchn" w:type="character">
-    <w:name w:val="Sprechblasentext Zchn"/>
-    <w:basedOn w:val="Absatz-Standardschriftart"/>
-    <w:link w:val="Sprechblasentext"/>
+  <w:style w:customStyle="1" w:styleId="BalloonTextChar" w:type="character">
+    <w:name w:val="Balloon Text Char"/>
+    <w:basedOn w:val="DefaultParagraphFont"/>
+    <w:link w:val="BalloonText"/>
     <w:uiPriority w:val="99"/>
     <w:semiHidden/>
     <w:rPr>
@@ -4231,9 +4132,9 @@
       <w:lang w:eastAsia="de-DE" w:val="de-DE"/>
     </w:rPr>
   </w:style>
-  <w:style w:styleId="Liste" w:type="paragraph">
+  <w:style w:styleId="List" w:type="paragraph">
     <w:name w:val="List"/>
-    <w:basedOn w:val="Standard"/>
+    <w:basedOn w:val="Normal"/>
     <w:uiPriority w:val="99"/>
     <w:unhideWhenUsed/>
     <w:pPr>
@@ -4241,10 +4142,10 @@
       <w:contextualSpacing/>
     </w:pPr>
   </w:style>
-  <w:style w:customStyle="1" w:styleId="TextkrperZchn" w:type="character">
-    <w:name w:val="Textkörper Zchn"/>
-    <w:basedOn w:val="Absatz-Standardschriftart"/>
-    <w:link w:val="Textkrper"/>
+  <w:style w:customStyle="1" w:styleId="BodyTextChar" w:type="character">
+    <w:name w:val="Body Text Char"/>
+    <w:basedOn w:val="DefaultParagraphFont"/>
+    <w:link w:val="BodyText"/>
     <w:rsid w:val="00336A23"/>
     <w:rPr>
       <w:sz w:val="22"/>
@@ -4252,9 +4153,9 @@
       <w:lang w:eastAsia="de-DE" w:val="de-DE"/>
     </w:rPr>
   </w:style>
-  <w:style w:styleId="Listennummer" w:type="paragraph">
+  <w:style w:styleId="ListNumber" w:type="paragraph">
     <w:name w:val="List Number"/>
-    <w:basedOn w:val="Standard"/>
+    <w:basedOn w:val="Normal"/>
     <w:uiPriority w:val="99"/>
     <w:unhideWhenUsed/>
     <w:pPr>
@@ -4264,9 +4165,9 @@
       <w:contextualSpacing/>
     </w:pPr>
   </w:style>
-  <w:style w:styleId="Aufzhlungszeichen" w:type="paragraph">
+  <w:style w:styleId="ListBullet" w:type="paragraph">
     <w:name w:val="List Bullet"/>
-    <w:basedOn w:val="Standard"/>
+    <w:basedOn w:val="Normal"/>
     <w:uiPriority w:val="99"/>
     <w:unhideWhenUsed/>
     <w:pPr>
@@ -4278,7 +4179,7 @@
   </w:style>
   <w:style w:customStyle="1" w:styleId="berschrift2Abstract" w:type="paragraph">
     <w:name w:val="Überschrift 2 Abstract"/>
-    <w:basedOn w:val="berschrift2"/>
+    <w:basedOn w:val="Heading2"/>
     <w:pPr>
       <w:numPr>
         <w:ilvl w:val="0"/>
@@ -4288,7 +4189,7 @@
   </w:style>
   <w:style w:customStyle="1" w:styleId="berschrift3Abstract" w:type="paragraph">
     <w:name w:val="Überschrift 3 Abstract"/>
-    <w:basedOn w:val="berschrift3"/>
+    <w:basedOn w:val="Heading3"/>
     <w:pPr>
       <w:numPr>
         <w:ilvl w:val="0"/>
@@ -4296,10 +4197,10 @@
       </w:numPr>
     </w:pPr>
   </w:style>
-  <w:style w:styleId="Beschriftung" w:type="paragraph">
+  <w:style w:styleId="Caption" w:type="paragraph">
     <w:name w:val="caption"/>
-    <w:basedOn w:val="Standard"/>
-    <w:next w:val="Standard"/>
+    <w:basedOn w:val="Normal"/>
+    <w:next w:val="Normal"/>
     <w:uiPriority w:val="35"/>
     <w:unhideWhenUsed/>
     <w:qFormat/>
@@ -4313,10 +4214,10 @@
       <w:szCs w:val="18"/>
     </w:rPr>
   </w:style>
-  <w:style w:styleId="Kommentartext" w:type="paragraph">
+  <w:style w:styleId="CommentText" w:type="paragraph">
     <w:name w:val="annotation text"/>
-    <w:basedOn w:val="Standard"/>
-    <w:link w:val="KommentartextZchn"/>
+    <w:basedOn w:val="Normal"/>
+    <w:link w:val="CommentTextChar"/>
     <w:uiPriority w:val="99"/>
     <w:unhideWhenUsed/>
     <w:pPr>
@@ -4327,10 +4228,10 @@
       <w:szCs w:val="20"/>
     </w:rPr>
   </w:style>
-  <w:style w:customStyle="1" w:styleId="KommentartextZchn" w:type="character">
-    <w:name w:val="Kommentartext Zchn"/>
-    <w:basedOn w:val="Absatz-Standardschriftart"/>
-    <w:link w:val="Kommentartext"/>
+  <w:style w:customStyle="1" w:styleId="CommentTextChar" w:type="character">
+    <w:name w:val="Comment Text Char"/>
+    <w:basedOn w:val="DefaultParagraphFont"/>
+    <w:link w:val="CommentText"/>
     <w:uiPriority w:val="99"/>
     <w:rPr>
       <w:sz w:val="20"/>
@@ -4338,9 +4239,9 @@
       <w:lang w:eastAsia="de-DE" w:val="de-DE"/>
     </w:rPr>
   </w:style>
-  <w:style w:styleId="Kommentarzeichen" w:type="character">
+  <w:style w:styleId="CommentReference" w:type="character">
     <w:name w:val="annotation reference"/>
-    <w:basedOn w:val="Absatz-Standardschriftart"/>
+    <w:basedOn w:val="DefaultParagraphFont"/>
     <w:uiPriority w:val="99"/>
     <w:semiHidden/>
     <w:unhideWhenUsed/>
@@ -4349,7 +4250,7 @@
       <w:szCs w:val="16"/>
     </w:rPr>
   </w:style>
-  <w:style w:styleId="berarbeitung" w:type="paragraph">
+  <w:style w:styleId="Revision" w:type="paragraph">
     <w:name w:val="Revision"/>
     <w:hidden/>
     <w:uiPriority w:val="99"/>
@@ -4360,11 +4261,11 @@
       <w:lang w:eastAsia="de-DE" w:val="de-DE"/>
     </w:rPr>
   </w:style>
-  <w:style w:styleId="Kommentarthema" w:type="paragraph">
+  <w:style w:styleId="CommentSubject" w:type="paragraph">
     <w:name w:val="annotation subject"/>
-    <w:basedOn w:val="Kommentartext"/>
-    <w:next w:val="Kommentartext"/>
-    <w:link w:val="KommentarthemaZchn"/>
+    <w:basedOn w:val="CommentText"/>
+    <w:next w:val="CommentText"/>
+    <w:link w:val="CommentSubjectChar"/>
     <w:uiPriority w:val="99"/>
     <w:semiHidden/>
     <w:unhideWhenUsed/>
@@ -4374,10 +4275,10 @@
       <w:bCs/>
     </w:rPr>
   </w:style>
-  <w:style w:customStyle="1" w:styleId="KommentarthemaZchn" w:type="character">
-    <w:name w:val="Kommentarthema Zchn"/>
-    <w:basedOn w:val="KommentartextZchn"/>
-    <w:link w:val="Kommentarthema"/>
+  <w:style w:customStyle="1" w:styleId="CommentSubjectChar" w:type="character">
+    <w:name w:val="Comment Subject Char"/>
+    <w:basedOn w:val="CommentTextChar"/>
+    <w:link w:val="CommentSubject"/>
     <w:uiPriority w:val="99"/>
     <w:semiHidden/>
     <w:rsid w:val="003A1D22"/>

</xml_diff>